<commit_message>
feat: complete master academic deliverables for BCA-508 final presentation (GitHub Pages deployment, 14-slide PPTX, 57-page report with code)
</commit_message>
<xml_diff>
--- a/BCA_508_HARMONY_Source_Code_Listing.docx
+++ b/BCA_508_HARMONY_Source_Code_Listing.docx
@@ -28844,6 +28844,23 @@
                 <w:color w:val="1E293B"/>
                 <w:sz w:val="15"/>
               </w:rPr>
+              <w:t xml:space="preserve">  base: './',</w:t>
+              <w:br/>
+            </w:r>
+            <w:r>
+              <w:rPr>
+                <w:rFonts w:ascii="Consolas" w:hAnsi="Consolas"/>
+                <w:color w:val="94A3B8"/>
+                <w:sz w:val="15"/>
+              </w:rPr>
+              <w:t xml:space="preserve">  6  </w:t>
+            </w:r>
+            <w:r>
+              <w:rPr>
+                <w:rFonts w:ascii="Consolas" w:hAnsi="Consolas"/>
+                <w:color w:val="1E293B"/>
+                <w:sz w:val="15"/>
+              </w:rPr>
               <w:t xml:space="preserve">  plugins: [react()],</w:t>
               <w:br/>
             </w:r>
@@ -28853,7 +28870,7 @@
                 <w:color w:val="94A3B8"/>
                 <w:sz w:val="15"/>
               </w:rPr>
-              <w:t xml:space="preserve">  6  </w:t>
+              <w:t xml:space="preserve">  7  </w:t>
             </w:r>
             <w:r>
               <w:rPr>
@@ -28870,7 +28887,7 @@
                 <w:color w:val="94A3B8"/>
                 <w:sz w:val="15"/>
               </w:rPr>
-              <w:t xml:space="preserve">  7  </w:t>
+              <w:t xml:space="preserve">  8  </w:t>
             </w:r>
             <w:r>
               <w:rPr>
@@ -28887,7 +28904,7 @@
                 <w:color w:val="94A3B8"/>
                 <w:sz w:val="15"/>
               </w:rPr>
-              <w:t xml:space="preserve">  8  </w:t>
+              <w:t xml:space="preserve">  9  </w:t>
             </w:r>
             <w:r>
               <w:rPr>
@@ -28904,7 +28921,7 @@
                 <w:color w:val="94A3B8"/>
                 <w:sz w:val="15"/>
               </w:rPr>
-              <w:t xml:space="preserve">  9  </w:t>
+              <w:t xml:space="preserve"> 10  </w:t>
             </w:r>
             <w:r>
               <w:rPr>
@@ -28921,7 +28938,7 @@
                 <w:color w:val="94A3B8"/>
                 <w:sz w:val="15"/>
               </w:rPr>
-              <w:t xml:space="preserve"> 10  </w:t>
+              <w:t xml:space="preserve"> 11  </w:t>
             </w:r>
             <w:r>
               <w:rPr>
@@ -28938,7 +28955,7 @@
                 <w:color w:val="94A3B8"/>
                 <w:sz w:val="15"/>
               </w:rPr>
-              <w:t xml:space="preserve"> 11  </w:t>
+              <w:t xml:space="preserve"> 12  </w:t>
             </w:r>
             <w:r>
               <w:rPr>
@@ -28955,7 +28972,7 @@
                 <w:color w:val="94A3B8"/>
                 <w:sz w:val="15"/>
               </w:rPr>
-              <w:t xml:space="preserve"> 12  </w:t>
+              <w:t xml:space="preserve"> 13  </w:t>
             </w:r>
             <w:r>
               <w:rPr>
@@ -28972,7 +28989,7 @@
                 <w:color w:val="94A3B8"/>
                 <w:sz w:val="15"/>
               </w:rPr>
-              <w:t xml:space="preserve"> 13  </w:t>
+              <w:t xml:space="preserve"> 14  </w:t>
             </w:r>
             <w:r>
               <w:rPr>
@@ -28989,7 +29006,7 @@
                 <w:color w:val="94A3B8"/>
                 <w:sz w:val="15"/>
               </w:rPr>
-              <w:t xml:space="preserve"> 14  </w:t>
+              <w:t xml:space="preserve"> 15  </w:t>
             </w:r>
             <w:r>
               <w:rPr>
@@ -29006,7 +29023,7 @@
                 <w:color w:val="94A3B8"/>
                 <w:sz w:val="15"/>
               </w:rPr>
-              <w:t xml:space="preserve"> 15  </w:t>
+              <w:t xml:space="preserve"> 16  </w:t>
             </w:r>
             <w:r>
               <w:rPr>

</xml_diff>